<commit_message>
Confirmación al familiar, teléfono y DPI
</commit_message>
<xml_diff>
--- a/docs/entregables/planificacion-del-proyecto.docx
+++ b/docs/entregables/planificacion-del-proyecto.docx
@@ -12,6 +12,76 @@
         </w:rPr>
       </w:pPr>
       <w:r>
+        <w:rPr>
+          <w:noProof/>
+        </w:rPr>
+        <w:drawing>
+          <wp:anchor distT="0" distB="0" distL="114300" distR="114300" simplePos="0" relativeHeight="251677696" behindDoc="1" locked="0" layoutInCell="1" allowOverlap="1" wp14:anchorId="201349F9" wp14:editId="0C3A5785">
+            <wp:simplePos x="0" y="0"/>
+            <wp:positionH relativeFrom="page">
+              <wp:posOffset>0</wp:posOffset>
+            </wp:positionH>
+            <wp:positionV relativeFrom="paragraph">
+              <wp:posOffset>-914400</wp:posOffset>
+            </wp:positionV>
+            <wp:extent cx="1816100" cy="1825625"/>
+            <wp:effectExtent l="0" t="0" r="0" b="3175"/>
+            <wp:wrapNone/>
+            <wp:docPr id="537322254" name="Imagen 1"/>
+            <wp:cNvGraphicFramePr>
+              <a:graphicFrameLocks xmlns:a="http://schemas.openxmlformats.org/drawingml/2006/main" noChangeAspect="1"/>
+            </wp:cNvGraphicFramePr>
+            <a:graphic xmlns:a="http://schemas.openxmlformats.org/drawingml/2006/main">
+              <a:graphicData uri="http://schemas.openxmlformats.org/drawingml/2006/picture">
+                <pic:pic xmlns:pic="http://schemas.openxmlformats.org/drawingml/2006/picture">
+                  <pic:nvPicPr>
+                    <pic:cNvPr id="0" name="Picture 1"/>
+                    <pic:cNvPicPr>
+                      <a:picLocks noChangeAspect="1" noChangeArrowheads="1"/>
+                    </pic:cNvPicPr>
+                  </pic:nvPicPr>
+                  <pic:blipFill>
+                    <a:blip r:embed="rId5">
+                      <a:extLst>
+                        <a:ext uri="{28A0092B-C50C-407E-A947-70E740481C1C}">
+                          <a14:useLocalDpi xmlns:a14="http://schemas.microsoft.com/office/drawing/2010/main" val="0"/>
+                        </a:ext>
+                      </a:extLst>
+                    </a:blip>
+                    <a:srcRect/>
+                    <a:stretch>
+                      <a:fillRect/>
+                    </a:stretch>
+                  </pic:blipFill>
+                  <pic:spPr bwMode="auto">
+                    <a:xfrm>
+                      <a:off x="0" y="0"/>
+                      <a:ext cx="1816100" cy="1825625"/>
+                    </a:xfrm>
+                    <a:prstGeom prst="rect">
+                      <a:avLst/>
+                    </a:prstGeom>
+                    <a:noFill/>
+                    <a:ln>
+                      <a:noFill/>
+                    </a:ln>
+                  </pic:spPr>
+                </pic:pic>
+              </a:graphicData>
+            </a:graphic>
+            <wp14:sizeRelH relativeFrom="page">
+              <wp14:pctWidth>0</wp14:pctWidth>
+            </wp14:sizeRelH>
+            <wp14:sizeRelV relativeFrom="page">
+              <wp14:pctHeight>0</wp14:pctHeight>
+            </wp14:sizeRelV>
+          </wp:anchor>
+        </w:drawing>
+      </w:r>
+      <w:r>
+        <w:rPr>
+          <w:noProof/>
+        </w:rPr>
         <w:drawing>
           <wp:anchor distT="0" distB="0" distL="114300" distR="114300" simplePos="0" relativeHeight="251658240" behindDoc="1" locked="0" layoutInCell="1" allowOverlap="1" wp14:anchorId="1764BF8B" wp14:editId="0F15037A">
             <wp:simplePos x="0" y="0"/>
@@ -681,6 +751,9 @@
     </w:p>
     <w:p>
       <w:r>
+        <w:rPr>
+          <w:noProof/>
+        </w:rPr>
         <w:lastRenderedPageBreak/>
         <w:drawing>
           <wp:inline distT="0" distB="0" distL="0" distR="0" wp14:anchorId="3CE9457A" wp14:editId="5C1B3C26">

</xml_diff>